<commit_message>
add limit to games request
</commit_message>
<xml_diff>
--- a/resources/documents/word/handball_simplified_rules.docx
+++ b/resources/documents/word/handball_simplified_rules.docx
@@ -1,6 +1,6 @@
 
 <file path=word/document.xml><?xml version="1.0" encoding="utf-8"?>
-<w:document xmlns:wpc="http://schemas.microsoft.com/office/word/2010/wordprocessingCanvas" xmlns:cx="http://schemas.microsoft.com/office/drawing/2014/chartex" xmlns:cx1="http://schemas.microsoft.com/office/drawing/2015/9/8/chartex" xmlns:cx2="http://schemas.microsoft.com/office/drawing/2015/10/21/chartex" xmlns:cx3="http://schemas.microsoft.com/office/drawing/2016/5/9/chartex" xmlns:cx4="http://schemas.microsoft.com/office/drawing/2016/5/10/chartex" xmlns:cx5="http://schemas.microsoft.com/office/drawing/2016/5/11/chartex" xmlns:cx6="http://schemas.microsoft.com/office/drawing/2016/5/12/chartex" xmlns:cx7="http://schemas.microsoft.com/office/drawing/2016/5/13/chartex" xmlns:cx8="http://schemas.microsoft.com/office/drawing/2016/5/14/chartex" xmlns:mc="http://schemas.openxmlformats.org/markup-compatibility/2006" xmlns:aink="http://schemas.microsoft.com/office/drawing/2016/ink" xmlns:am3d="http://schemas.microsoft.com/office/drawing/2017/model3d" xmlns:o="urn:schemas-microsoft-com:office:office" xmlns:oel="http://schemas.microsoft.com/office/2019/extlst" xmlns:r="http://schemas.openxmlformats.org/officeDocument/2006/relationships" xmlns:m="http://schemas.openxmlformats.org/officeDocument/2006/math" xmlns:v="urn:schemas-microsoft-com:vml" xmlns:wp14="http://schemas.microsoft.com/office/word/2010/wordprocessingDrawing" xmlns:wp="http://schemas.openxmlformats.org/drawingml/2006/wordprocessingDrawing" xmlns:w10="urn:schemas-microsoft-com:office:word" xmlns:w="http://schemas.openxmlformats.org/wordprocessingml/2006/main" xmlns:w14="http://schemas.microsoft.com/office/word/2010/wordml" xmlns:w15="http://schemas.microsoft.com/office/word/2012/wordml" xmlns:w16cex="http://schemas.microsoft.com/office/word/2018/wordml/cex" xmlns:w16cid="http://schemas.microsoft.com/office/word/2016/wordml/cid" xmlns:w16="http://schemas.microsoft.com/office/word/2018/wordml" xmlns:w16sdtdh="http://schemas.microsoft.com/office/word/2020/wordml/sdtdatahash" xmlns:w16se="http://schemas.microsoft.com/office/word/2015/wordml/symex" xmlns:wpg="http://schemas.microsoft.com/office/word/2010/wordprocessingGroup" xmlns:wpi="http://schemas.microsoft.com/office/word/2010/wordprocessingInk" xmlns:wne="http://schemas.microsoft.com/office/word/2006/wordml" xmlns:wps="http://schemas.microsoft.com/office/word/2010/wordprocessingShape" mc:Ignorable="w14 w15 w16se w16cid w16 w16cex w16sdtdh wp14">
+<w:document xmlns:wpc="http://schemas.microsoft.com/office/word/2010/wordprocessingCanvas" xmlns:cx="http://schemas.microsoft.com/office/drawing/2014/chartex" xmlns:cx1="http://schemas.microsoft.com/office/drawing/2015/9/8/chartex" xmlns:cx2="http://schemas.microsoft.com/office/drawing/2015/10/21/chartex" xmlns:cx3="http://schemas.microsoft.com/office/drawing/2016/5/9/chartex" xmlns:cx4="http://schemas.microsoft.com/office/drawing/2016/5/10/chartex" xmlns:cx5="http://schemas.microsoft.com/office/drawing/2016/5/11/chartex" xmlns:cx6="http://schemas.microsoft.com/office/drawing/2016/5/12/chartex" xmlns:cx7="http://schemas.microsoft.com/office/drawing/2016/5/13/chartex" xmlns:cx8="http://schemas.microsoft.com/office/drawing/2016/5/14/chartex" xmlns:mc="http://schemas.openxmlformats.org/markup-compatibility/2006" xmlns:aink="http://schemas.microsoft.com/office/drawing/2016/ink" xmlns:am3d="http://schemas.microsoft.com/office/drawing/2017/model3d" xmlns:o="urn:schemas-microsoft-com:office:office" xmlns:oel="http://schemas.microsoft.com/office/2019/extlst" xmlns:r="http://schemas.openxmlformats.org/officeDocument/2006/relationships" xmlns:m="http://schemas.openxmlformats.org/officeDocument/2006/math" xmlns:v="urn:schemas-microsoft-com:vml" xmlns:wp14="http://schemas.microsoft.com/office/word/2010/wordprocessingDrawing" xmlns:wp="http://schemas.openxmlformats.org/drawingml/2006/wordprocessingDrawing" xmlns:w10="urn:schemas-microsoft-com:office:word" xmlns:w="http://schemas.openxmlformats.org/wordprocessingml/2006/main" xmlns:w14="http://schemas.microsoft.com/office/word/2010/wordml" xmlns:w15="http://schemas.microsoft.com/office/word/2012/wordml" xmlns:w16cex="http://schemas.microsoft.com/office/word/2018/wordml/cex" xmlns:w16cid="http://schemas.microsoft.com/office/word/2016/wordml/cid" xmlns:w16="http://schemas.microsoft.com/office/word/2018/wordml" xmlns:w16du="http://schemas.microsoft.com/office/word/2023/wordml/word16du" xmlns:w16sdtdh="http://schemas.microsoft.com/office/word/2020/wordml/sdtdatahash" xmlns:w16sdtfl="http://schemas.microsoft.com/office/word/2024/wordml/sdtformatlock" xmlns:w16se="http://schemas.microsoft.com/office/word/2015/wordml/symex" xmlns:wpg="http://schemas.microsoft.com/office/word/2010/wordprocessingGroup" xmlns:wpi="http://schemas.microsoft.com/office/word/2010/wordprocessingInk" xmlns:wne="http://schemas.microsoft.com/office/word/2006/wordml" xmlns:wps="http://schemas.microsoft.com/office/word/2010/wordprocessingShape" mc:Ignorable="w14 w15 w16se w16cid w16 w16cex w16sdtdh w16sdtfl w16du wp14">
   <w:background w:color="FDEFDB"/>
   <w:body>
     <w:p>
@@ -14,87 +14,18 @@
       </w:pPr>
       <w:r>
         <w:rPr>
-          <w:rFonts w:ascii="Montserrat" w:hAnsi="Montserrat"/>
           <w:noProof/>
-          <w:color w:val="2E7660"/>
         </w:rPr>
         <w:drawing>
-          <wp:anchor distT="0" distB="0" distL="114300" distR="114300" simplePos="0" relativeHeight="251697152" behindDoc="0" locked="0" layoutInCell="1" allowOverlap="1" wp14:anchorId="2B60A67A" wp14:editId="7C54B120">
-            <wp:simplePos x="0" y="0"/>
-            <wp:positionH relativeFrom="margin">
-              <wp:posOffset>4714875</wp:posOffset>
-            </wp:positionH>
-            <wp:positionV relativeFrom="paragraph">
-              <wp:posOffset>-192042</wp:posOffset>
-            </wp:positionV>
-            <wp:extent cx="1931035" cy="2089785"/>
-            <wp:effectExtent l="0" t="0" r="0" b="5715"/>
-            <wp:wrapNone/>
-            <wp:docPr id="707702927" name="Picture 6"/>
-            <wp:cNvGraphicFramePr>
-              <a:graphicFrameLocks xmlns:a="http://schemas.openxmlformats.org/drawingml/2006/main" noChangeAspect="1"/>
-            </wp:cNvGraphicFramePr>
-            <a:graphic xmlns:a="http://schemas.openxmlformats.org/drawingml/2006/main">
-              <a:graphicData uri="http://schemas.openxmlformats.org/drawingml/2006/picture">
-                <pic:pic xmlns:pic="http://schemas.openxmlformats.org/drawingml/2006/picture">
-                  <pic:nvPicPr>
-                    <pic:cNvPr id="0" name="Picture 13"/>
-                    <pic:cNvPicPr>
-                      <a:picLocks noChangeAspect="1" noChangeArrowheads="1"/>
-                    </pic:cNvPicPr>
-                  </pic:nvPicPr>
-                  <pic:blipFill>
-                    <a:blip r:embed="rId8" cstate="print">
-                      <a:extLst>
-                        <a:ext uri="{28A0092B-C50C-407E-A947-70E740481C1C}">
-                          <a14:useLocalDpi xmlns:a14="http://schemas.microsoft.com/office/drawing/2010/main" val="0"/>
-                        </a:ext>
-                      </a:extLst>
-                    </a:blip>
-                    <a:srcRect/>
-                    <a:stretch>
-                      <a:fillRect/>
-                    </a:stretch>
-                  </pic:blipFill>
-                  <pic:spPr bwMode="auto">
-                    <a:xfrm>
-                      <a:off x="0" y="0"/>
-                      <a:ext cx="1931035" cy="2089785"/>
-                    </a:xfrm>
-                    <a:prstGeom prst="rect">
-                      <a:avLst/>
-                    </a:prstGeom>
-                    <a:noFill/>
-                    <a:ln>
-                      <a:noFill/>
-                    </a:ln>
-                  </pic:spPr>
-                </pic:pic>
-              </a:graphicData>
-            </a:graphic>
-            <wp14:sizeRelH relativeFrom="page">
-              <wp14:pctWidth>0</wp14:pctWidth>
-            </wp14:sizeRelH>
-            <wp14:sizeRelV relativeFrom="page">
-              <wp14:pctHeight>0</wp14:pctHeight>
-            </wp14:sizeRelV>
-          </wp:anchor>
-        </w:drawing>
-      </w:r>
-      <w:r>
-        <w:rPr>
-          <w:noProof/>
-        </w:rPr>
-        <w:drawing>
-          <wp:anchor distT="0" distB="0" distL="114300" distR="114300" simplePos="0" relativeHeight="251696128" behindDoc="0" locked="0" layoutInCell="1" allowOverlap="1" wp14:anchorId="5BF8CE5D" wp14:editId="1BA2F0FD">
+          <wp:anchor distT="0" distB="0" distL="114300" distR="114300" simplePos="0" relativeHeight="251696128" behindDoc="0" locked="0" layoutInCell="1" allowOverlap="1" wp14:anchorId="5BF8CE5D" wp14:editId="0D3678B3">
             <wp:simplePos x="0" y="0"/>
             <wp:positionH relativeFrom="margin">
               <wp:posOffset>3913505</wp:posOffset>
             </wp:positionH>
             <wp:positionV relativeFrom="margin">
-              <wp:posOffset>301764</wp:posOffset>
+              <wp:posOffset>132451</wp:posOffset>
             </wp:positionV>
-            <wp:extent cx="314373" cy="307362"/>
+            <wp:extent cx="314325" cy="307340"/>
             <wp:effectExtent l="0" t="0" r="9525" b="0"/>
             <wp:wrapNone/>
             <wp:docPr id="2059582387" name="Picture 6" descr="A circular logo with a logo on it&#10;&#10;Description automatically generated"/>
@@ -111,7 +42,7 @@
                     </pic:cNvPicPr>
                   </pic:nvPicPr>
                   <pic:blipFill>
-                    <a:blip r:embed="rId9" cstate="print">
+                    <a:blip r:embed="rId8" cstate="print">
                       <a:extLst>
                         <a:ext uri="{28A0092B-C50C-407E-A947-70E740481C1C}">
                           <a14:useLocalDpi xmlns:a14="http://schemas.microsoft.com/office/drawing/2010/main" val="0"/>
@@ -125,7 +56,7 @@
                   <pic:spPr>
                     <a:xfrm>
                       <a:off x="0" y="0"/>
-                      <a:ext cx="314373" cy="307362"/>
+                      <a:ext cx="314325" cy="307340"/>
                     </a:xfrm>
                     <a:prstGeom prst="rect">
                       <a:avLst/>
@@ -153,13 +84,13 @@
         <mc:AlternateContent>
           <mc:Choice Requires="wps">
             <w:drawing>
-              <wp:anchor distT="0" distB="0" distL="114300" distR="114300" simplePos="0" relativeHeight="251694080" behindDoc="0" locked="0" layoutInCell="1" allowOverlap="1" wp14:anchorId="06CE8A92" wp14:editId="5D76C7C7">
+              <wp:anchor distT="0" distB="0" distL="114300" distR="114300" simplePos="0" relativeHeight="251694080" behindDoc="0" locked="0" layoutInCell="1" allowOverlap="1" wp14:anchorId="06CE8A92" wp14:editId="2E4AC037">
                 <wp:simplePos x="0" y="0"/>
                 <wp:positionH relativeFrom="margin">
-                  <wp:posOffset>3090</wp:posOffset>
+                  <wp:posOffset>2540</wp:posOffset>
                 </wp:positionH>
                 <wp:positionV relativeFrom="page">
-                  <wp:posOffset>355562</wp:posOffset>
+                  <wp:posOffset>191063</wp:posOffset>
                 </wp:positionV>
                 <wp:extent cx="5213350" cy="859809"/>
                 <wp:effectExtent l="0" t="0" r="0" b="0"/>
@@ -293,7 +224,7 @@
                 <v:stroke joinstyle="miter"/>
                 <v:path gradientshapeok="t" o:connecttype="rect"/>
               </v:shapetype>
-              <v:shape id="Text Box 4" o:spid="_x0000_s1026" type="#_x0000_t202" style="position:absolute;margin-left:.25pt;margin-top:28pt;width:410.5pt;height:67.7pt;z-index:251694080;visibility:visible;mso-wrap-style:square;mso-width-percent:0;mso-height-percent:0;mso-wrap-distance-left:9pt;mso-wrap-distance-top:0;mso-wrap-distance-right:9pt;mso-wrap-distance-bottom:0;mso-position-horizontal:absolute;mso-position-horizontal-relative:margin;mso-position-vertical:absolute;mso-position-vertical-relative:page;mso-width-percent:0;mso-height-percent:0;mso-width-relative:margin;mso-height-relative:margin;v-text-anchor:top" o:gfxdata="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" filled="f" stroked="f" strokeweight=".5pt">
+              <v:shape id="Text Box 4" o:spid="_x0000_s1026" type="#_x0000_t202" style="position:absolute;margin-left:.2pt;margin-top:15.05pt;width:410.5pt;height:67.7pt;z-index:251694080;visibility:visible;mso-wrap-style:square;mso-width-percent:0;mso-height-percent:0;mso-wrap-distance-left:9pt;mso-wrap-distance-top:0;mso-wrap-distance-right:9pt;mso-wrap-distance-bottom:0;mso-position-horizontal:absolute;mso-position-horizontal-relative:margin;mso-position-vertical:absolute;mso-position-vertical-relative:page;mso-width-percent:0;mso-height-percent:0;mso-width-relative:margin;mso-height-relative:margin;v-text-anchor:top" o:gfxdata="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" filled="f" stroked="f" strokeweight=".5pt">
                 <v:textbox>
                   <w:txbxContent>
                     <w:p>
@@ -387,6 +318,75 @@
         </mc:AlternateContent>
       </w:r>
       <w:r>
+        <w:rPr>
+          <w:rFonts w:ascii="Montserrat" w:hAnsi="Montserrat"/>
+          <w:noProof/>
+          <w:color w:val="2E7660"/>
+        </w:rPr>
+        <w:drawing>
+          <wp:anchor distT="0" distB="0" distL="114300" distR="114300" simplePos="0" relativeHeight="251697152" behindDoc="0" locked="0" layoutInCell="1" allowOverlap="1" wp14:anchorId="2B60A67A" wp14:editId="3B7A58C0">
+            <wp:simplePos x="0" y="0"/>
+            <wp:positionH relativeFrom="margin">
+              <wp:posOffset>4714875</wp:posOffset>
+            </wp:positionH>
+            <wp:positionV relativeFrom="paragraph">
+              <wp:posOffset>-192042</wp:posOffset>
+            </wp:positionV>
+            <wp:extent cx="1931035" cy="2089785"/>
+            <wp:effectExtent l="0" t="0" r="0" b="5715"/>
+            <wp:wrapNone/>
+            <wp:docPr id="707702927" name="Picture 6"/>
+            <wp:cNvGraphicFramePr>
+              <a:graphicFrameLocks xmlns:a="http://schemas.openxmlformats.org/drawingml/2006/main" noChangeAspect="1"/>
+            </wp:cNvGraphicFramePr>
+            <a:graphic xmlns:a="http://schemas.openxmlformats.org/drawingml/2006/main">
+              <a:graphicData uri="http://schemas.openxmlformats.org/drawingml/2006/picture">
+                <pic:pic xmlns:pic="http://schemas.openxmlformats.org/drawingml/2006/picture">
+                  <pic:nvPicPr>
+                    <pic:cNvPr id="0" name="Picture 13"/>
+                    <pic:cNvPicPr>
+                      <a:picLocks noChangeAspect="1" noChangeArrowheads="1"/>
+                    </pic:cNvPicPr>
+                  </pic:nvPicPr>
+                  <pic:blipFill>
+                    <a:blip r:embed="rId9" cstate="print">
+                      <a:extLst>
+                        <a:ext uri="{28A0092B-C50C-407E-A947-70E740481C1C}">
+                          <a14:useLocalDpi xmlns:a14="http://schemas.microsoft.com/office/drawing/2010/main" val="0"/>
+                        </a:ext>
+                      </a:extLst>
+                    </a:blip>
+                    <a:srcRect/>
+                    <a:stretch>
+                      <a:fillRect/>
+                    </a:stretch>
+                  </pic:blipFill>
+                  <pic:spPr bwMode="auto">
+                    <a:xfrm>
+                      <a:off x="0" y="0"/>
+                      <a:ext cx="1931035" cy="2089785"/>
+                    </a:xfrm>
+                    <a:prstGeom prst="rect">
+                      <a:avLst/>
+                    </a:prstGeom>
+                    <a:noFill/>
+                    <a:ln>
+                      <a:noFill/>
+                    </a:ln>
+                  </pic:spPr>
+                </pic:pic>
+              </a:graphicData>
+            </a:graphic>
+            <wp14:sizeRelH relativeFrom="page">
+              <wp14:pctWidth>0</wp14:pctWidth>
+            </wp14:sizeRelH>
+            <wp14:sizeRelV relativeFrom="page">
+              <wp14:pctHeight>0</wp14:pctHeight>
+            </wp14:sizeRelV>
+          </wp:anchor>
+        </w:drawing>
+      </w:r>
+      <w:r>
         <w:t xml:space="preserve"> </w:t>
       </w:r>
     </w:p>
@@ -409,13 +409,13 @@
         <mc:AlternateContent>
           <mc:Choice Requires="wps">
             <w:drawing>
-              <wp:anchor distT="0" distB="0" distL="114300" distR="114300" simplePos="0" relativeHeight="251695104" behindDoc="0" locked="0" layoutInCell="1" allowOverlap="1" wp14:anchorId="0A2596C8" wp14:editId="6269BCAB">
+              <wp:anchor distT="0" distB="0" distL="114300" distR="114300" simplePos="0" relativeHeight="251695104" behindDoc="0" locked="0" layoutInCell="1" allowOverlap="1" wp14:anchorId="0A2596C8" wp14:editId="6932C0B3">
                 <wp:simplePos x="0" y="0"/>
                 <wp:positionH relativeFrom="margin">
-                  <wp:posOffset>1250865</wp:posOffset>
+                  <wp:posOffset>1250315</wp:posOffset>
                 </wp:positionH>
                 <wp:positionV relativeFrom="paragraph">
-                  <wp:posOffset>230467</wp:posOffset>
+                  <wp:posOffset>65968</wp:posOffset>
                 </wp:positionV>
                 <wp:extent cx="4148920" cy="818866"/>
                 <wp:effectExtent l="0" t="0" r="0" b="635"/>
@@ -492,7 +492,7 @@
           </mc:Choice>
           <mc:Fallback>
             <w:pict>
-              <v:shape w14:anchorId="0A2596C8" id="Text Box 2" o:spid="_x0000_s1027" type="#_x0000_t202" style="position:absolute;margin-left:98.5pt;margin-top:18.15pt;width:326.7pt;height:64.5pt;z-index:251695104;visibility:visible;mso-wrap-style:square;mso-wrap-distance-left:9pt;mso-wrap-distance-top:0;mso-wrap-distance-right:9pt;mso-wrap-distance-bottom:0;mso-position-horizontal:absolute;mso-position-horizontal-relative:margin;mso-position-vertical:absolute;mso-position-vertical-relative:text;v-text-anchor:top" o:gfxdata="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" filled="f" stroked="f" strokeweight=".5pt">
+              <v:shape w14:anchorId="0A2596C8" id="Text Box 2" o:spid="_x0000_s1027" type="#_x0000_t202" style="position:absolute;margin-left:98.45pt;margin-top:5.2pt;width:326.7pt;height:64.5pt;z-index:251695104;visibility:visible;mso-wrap-style:square;mso-wrap-distance-left:9pt;mso-wrap-distance-top:0;mso-wrap-distance-right:9pt;mso-wrap-distance-bottom:0;mso-position-horizontal:absolute;mso-position-horizontal-relative:margin;mso-position-vertical:absolute;mso-position-vertical-relative:text;v-text-anchor:top" o:gfxdata="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" filled="f" stroked="f" strokeweight=".5pt">
                 <v:textbox>
                   <w:txbxContent>
                     <w:p>
@@ -553,16 +553,6 @@
       <w:pPr>
         <w:pStyle w:val="handballheadings"/>
         <w:rPr>
-          <w:color w:val="F94144"/>
-          <w:sz w:val="48"/>
-          <w:szCs w:val="48"/>
-        </w:rPr>
-      </w:pPr>
-    </w:p>
-    <w:p>
-      <w:pPr>
-        <w:pStyle w:val="handballheadings"/>
-        <w:rPr>
           <w:color w:val="EA103A"/>
           <w:sz w:val="48"/>
           <w:szCs w:val="48"/>
@@ -778,6 +768,13 @@
           <w:color w:val="D2530C"/>
         </w:rPr>
         <w:t>If these rules are not conformed to, a fault is received. Two faults in a row, and the other team wins the point.</w:t>
+      </w:r>
+      <w:r>
+        <w:rPr>
+          <w:rFonts w:ascii="Montserrat" w:hAnsi="Montserrat"/>
+          <w:color w:val="D2530C"/>
+        </w:rPr>
+        <w:t xml:space="preserve"> If you served and you win the point, you swap sides and serve again!  If you didn’t serve the point, whoever served last for your team doesn’t serve.</w:t>
       </w:r>
     </w:p>
     <w:p>
@@ -1310,7 +1307,35 @@
           <w:rFonts w:ascii="Montserrat" w:hAnsi="Montserrat"/>
           <w:color w:val="577590"/>
         </w:rPr>
-        <w:t>If the ball would’ve been in if the wall was not there, the rebound is in.</w:t>
+        <w:t xml:space="preserve">If the ball </w:t>
+      </w:r>
+      <w:r>
+        <w:rPr>
+          <w:rFonts w:ascii="Montserrat" w:hAnsi="Montserrat"/>
+          <w:color w:val="577590"/>
+        </w:rPr>
+        <w:t xml:space="preserve">has already bounced </w:t>
+      </w:r>
+      <w:r>
+        <w:rPr>
+          <w:rFonts w:ascii="Montserrat" w:hAnsi="Montserrat"/>
+          <w:color w:val="577590"/>
+        </w:rPr>
+        <w:t xml:space="preserve">in the </w:t>
+      </w:r>
+      <w:r>
+        <w:rPr>
+          <w:rFonts w:ascii="Montserrat" w:hAnsi="Montserrat"/>
+          <w:color w:val="577590"/>
+        </w:rPr>
+        <w:t>other team’s square</w:t>
+      </w:r>
+      <w:r>
+        <w:rPr>
+          <w:rFonts w:ascii="Montserrat" w:hAnsi="Montserrat"/>
+          <w:color w:val="577590"/>
+        </w:rPr>
+        <w:t>, the rebound is in.</w:t>
       </w:r>
     </w:p>
     <w:p>
@@ -2534,14 +2559,18 @@
                             <w:pPr>
                               <w:pStyle w:val="handball"/>
                               <w:jc w:val="center"/>
+                              <w:rPr>
+                                <w:lang w:val="en-US"/>
+                              </w:rPr>
                             </w:pPr>
                             <w:r>
                               <w:rPr>
                                 <w:rFonts w:ascii="Montserrat" w:hAnsi="Montserrat"/>
                                 <w:sz w:val="18"/>
                                 <w:szCs w:val="18"/>
+                                <w:lang w:val="en-US"/>
                               </w:rPr>
-                              <w:t>carry any penalty besides shaming from your peers.</w:t>
+                              <w:t>meaning that you will have to sit off the court for two rounds</w:t>
                             </w:r>
                           </w:p>
                         </w:txbxContent>
@@ -2570,14 +2599,18 @@
                       <w:pPr>
                         <w:pStyle w:val="handball"/>
                         <w:jc w:val="center"/>
+                        <w:rPr>
+                          <w:lang w:val="en-US"/>
+                        </w:rPr>
                       </w:pPr>
                       <w:r>
                         <w:rPr>
                           <w:rFonts w:ascii="Montserrat" w:hAnsi="Montserrat"/>
                           <w:sz w:val="18"/>
                           <w:szCs w:val="18"/>
+                          <w:lang w:val="en-US"/>
                         </w:rPr>
-                        <w:t>carry any penalty besides shaming from your peers.</w:t>
+                        <w:t>meaning that you will have to sit off the court for two rounds</w:t>
                       </w:r>
                     </w:p>
                   </w:txbxContent>
@@ -2675,7 +2708,7 @@
                                 <w:sz w:val="18"/>
                                 <w:szCs w:val="18"/>
                               </w:rPr>
-                              <w:t>A Green Card is simply a warning and</w:t>
+                              <w:t xml:space="preserve">A Green Card </w:t>
                             </w:r>
                             <w:r>
                               <w:rPr>
@@ -2683,7 +2716,44 @@
                                 <w:sz w:val="18"/>
                                 <w:szCs w:val="18"/>
                               </w:rPr>
-                              <w:t xml:space="preserve"> does not </w:t>
+                              <w:t xml:space="preserve">carries a </w:t>
+                            </w:r>
+                          </w:p>
+                          <w:p>
+                            <w:pPr>
+                              <w:pStyle w:val="handball"/>
+                              <w:jc w:val="center"/>
+                              <w:rPr>
+                                <w:rFonts w:ascii="Montserrat" w:hAnsi="Montserrat"/>
+                                <w:sz w:val="18"/>
+                                <w:szCs w:val="18"/>
+                              </w:rPr>
+                            </w:pPr>
+                            <w:r>
+                              <w:rPr>
+                                <w:rFonts w:ascii="Montserrat" w:hAnsi="Montserrat"/>
+                                <w:sz w:val="18"/>
+                                <w:szCs w:val="18"/>
+                              </w:rPr>
+                              <w:t xml:space="preserve">two round </w:t>
+                            </w:r>
+                            <w:proofErr w:type="gramStart"/>
+                            <w:r>
+                              <w:rPr>
+                                <w:rFonts w:ascii="Montserrat" w:hAnsi="Montserrat"/>
+                                <w:sz w:val="18"/>
+                                <w:szCs w:val="18"/>
+                              </w:rPr>
+                              <w:t>suspension</w:t>
+                            </w:r>
+                            <w:proofErr w:type="gramEnd"/>
+                            <w:r>
+                              <w:rPr>
+                                <w:rFonts w:ascii="Montserrat" w:hAnsi="Montserrat"/>
+                                <w:sz w:val="18"/>
+                                <w:szCs w:val="18"/>
+                              </w:rPr>
+                              <w:t>,</w:t>
                             </w:r>
                           </w:p>
                           <w:p>
@@ -2790,7 +2860,7 @@
                           <w:sz w:val="18"/>
                           <w:szCs w:val="18"/>
                         </w:rPr>
-                        <w:t>A Green Card is simply a warning and</w:t>
+                        <w:t xml:space="preserve">A Green Card </w:t>
                       </w:r>
                       <w:r>
                         <w:rPr>
@@ -2798,7 +2868,44 @@
                           <w:sz w:val="18"/>
                           <w:szCs w:val="18"/>
                         </w:rPr>
-                        <w:t xml:space="preserve"> does not </w:t>
+                        <w:t xml:space="preserve">carries a </w:t>
+                      </w:r>
+                    </w:p>
+                    <w:p>
+                      <w:pPr>
+                        <w:pStyle w:val="handball"/>
+                        <w:jc w:val="center"/>
+                        <w:rPr>
+                          <w:rFonts w:ascii="Montserrat" w:hAnsi="Montserrat"/>
+                          <w:sz w:val="18"/>
+                          <w:szCs w:val="18"/>
+                        </w:rPr>
+                      </w:pPr>
+                      <w:r>
+                        <w:rPr>
+                          <w:rFonts w:ascii="Montserrat" w:hAnsi="Montserrat"/>
+                          <w:sz w:val="18"/>
+                          <w:szCs w:val="18"/>
+                        </w:rPr>
+                        <w:t xml:space="preserve">two round </w:t>
+                      </w:r>
+                      <w:proofErr w:type="gramStart"/>
+                      <w:r>
+                        <w:rPr>
+                          <w:rFonts w:ascii="Montserrat" w:hAnsi="Montserrat"/>
+                          <w:sz w:val="18"/>
+                          <w:szCs w:val="18"/>
+                        </w:rPr>
+                        <w:t>suspension</w:t>
+                      </w:r>
+                      <w:proofErr w:type="gramEnd"/>
+                      <w:r>
+                        <w:rPr>
+                          <w:rFonts w:ascii="Montserrat" w:hAnsi="Montserrat"/>
+                          <w:sz w:val="18"/>
+                          <w:szCs w:val="18"/>
+                        </w:rPr>
+                        <w:t>,</w:t>
                       </w:r>
                     </w:p>
                     <w:p>
@@ -2853,7 +2960,7 @@
 </file>
 
 <file path=word/endnotes.xml><?xml version="1.0" encoding="utf-8"?>
-<w:endnotes xmlns:wpc="http://schemas.microsoft.com/office/word/2010/wordprocessingCanvas" xmlns:cx="http://schemas.microsoft.com/office/drawing/2014/chartex" xmlns:cx1="http://schemas.microsoft.com/office/drawing/2015/9/8/chartex" xmlns:cx2="http://schemas.microsoft.com/office/drawing/2015/10/21/chartex" xmlns:cx3="http://schemas.microsoft.com/office/drawing/2016/5/9/chartex" xmlns:cx4="http://schemas.microsoft.com/office/drawing/2016/5/10/chartex" xmlns:cx5="http://schemas.microsoft.com/office/drawing/2016/5/11/chartex" xmlns:cx6="http://schemas.microsoft.com/office/drawing/2016/5/12/chartex" xmlns:cx7="http://schemas.microsoft.com/office/drawing/2016/5/13/chartex" xmlns:cx8="http://schemas.microsoft.com/office/drawing/2016/5/14/chartex" xmlns:mc="http://schemas.openxmlformats.org/markup-compatibility/2006" xmlns:aink="http://schemas.microsoft.com/office/drawing/2016/ink" xmlns:am3d="http://schemas.microsoft.com/office/drawing/2017/model3d" xmlns:o="urn:schemas-microsoft-com:office:office" xmlns:oel="http://schemas.microsoft.com/office/2019/extlst" xmlns:r="http://schemas.openxmlformats.org/officeDocument/2006/relationships" xmlns:m="http://schemas.openxmlformats.org/officeDocument/2006/math" xmlns:v="urn:schemas-microsoft-com:vml" xmlns:wp14="http://schemas.microsoft.com/office/word/2010/wordprocessingDrawing" xmlns:wp="http://schemas.openxmlformats.org/drawingml/2006/wordprocessingDrawing" xmlns:w10="urn:schemas-microsoft-com:office:word" xmlns:w="http://schemas.openxmlformats.org/wordprocessingml/2006/main" xmlns:w14="http://schemas.microsoft.com/office/word/2010/wordml" xmlns:w15="http://schemas.microsoft.com/office/word/2012/wordml" xmlns:w16cex="http://schemas.microsoft.com/office/word/2018/wordml/cex" xmlns:w16cid="http://schemas.microsoft.com/office/word/2016/wordml/cid" xmlns:w16="http://schemas.microsoft.com/office/word/2018/wordml" xmlns:w16sdtdh="http://schemas.microsoft.com/office/word/2020/wordml/sdtdatahash" xmlns:w16se="http://schemas.microsoft.com/office/word/2015/wordml/symex" xmlns:wpg="http://schemas.microsoft.com/office/word/2010/wordprocessingGroup" xmlns:wpi="http://schemas.microsoft.com/office/word/2010/wordprocessingInk" xmlns:wne="http://schemas.microsoft.com/office/word/2006/wordml" xmlns:wps="http://schemas.microsoft.com/office/word/2010/wordprocessingShape" mc:Ignorable="w14 w15 w16se w16cid w16 w16cex w16sdtdh wp14">
+<w:endnotes xmlns:wpc="http://schemas.microsoft.com/office/word/2010/wordprocessingCanvas" xmlns:cx="http://schemas.microsoft.com/office/drawing/2014/chartex" xmlns:cx1="http://schemas.microsoft.com/office/drawing/2015/9/8/chartex" xmlns:cx2="http://schemas.microsoft.com/office/drawing/2015/10/21/chartex" xmlns:cx3="http://schemas.microsoft.com/office/drawing/2016/5/9/chartex" xmlns:cx4="http://schemas.microsoft.com/office/drawing/2016/5/10/chartex" xmlns:cx5="http://schemas.microsoft.com/office/drawing/2016/5/11/chartex" xmlns:cx6="http://schemas.microsoft.com/office/drawing/2016/5/12/chartex" xmlns:cx7="http://schemas.microsoft.com/office/drawing/2016/5/13/chartex" xmlns:cx8="http://schemas.microsoft.com/office/drawing/2016/5/14/chartex" xmlns:mc="http://schemas.openxmlformats.org/markup-compatibility/2006" xmlns:aink="http://schemas.microsoft.com/office/drawing/2016/ink" xmlns:am3d="http://schemas.microsoft.com/office/drawing/2017/model3d" xmlns:o="urn:schemas-microsoft-com:office:office" xmlns:oel="http://schemas.microsoft.com/office/2019/extlst" xmlns:r="http://schemas.openxmlformats.org/officeDocument/2006/relationships" xmlns:m="http://schemas.openxmlformats.org/officeDocument/2006/math" xmlns:v="urn:schemas-microsoft-com:vml" xmlns:wp14="http://schemas.microsoft.com/office/word/2010/wordprocessingDrawing" xmlns:wp="http://schemas.openxmlformats.org/drawingml/2006/wordprocessingDrawing" xmlns:w10="urn:schemas-microsoft-com:office:word" xmlns:w="http://schemas.openxmlformats.org/wordprocessingml/2006/main" xmlns:w14="http://schemas.microsoft.com/office/word/2010/wordml" xmlns:w15="http://schemas.microsoft.com/office/word/2012/wordml" xmlns:w16cex="http://schemas.microsoft.com/office/word/2018/wordml/cex" xmlns:w16cid="http://schemas.microsoft.com/office/word/2016/wordml/cid" xmlns:w16="http://schemas.microsoft.com/office/word/2018/wordml" xmlns:w16du="http://schemas.microsoft.com/office/word/2023/wordml/word16du" xmlns:w16sdtdh="http://schemas.microsoft.com/office/word/2020/wordml/sdtdatahash" xmlns:w16sdtfl="http://schemas.microsoft.com/office/word/2024/wordml/sdtformatlock" xmlns:w16se="http://schemas.microsoft.com/office/word/2015/wordml/symex" xmlns:wpg="http://schemas.microsoft.com/office/word/2010/wordprocessingGroup" xmlns:wpi="http://schemas.microsoft.com/office/word/2010/wordprocessingInk" xmlns:wne="http://schemas.microsoft.com/office/word/2006/wordml" xmlns:wps="http://schemas.microsoft.com/office/word/2010/wordprocessingShape" mc:Ignorable="w14 w15 w16se w16cid w16 w16cex w16sdtdh w16sdtfl w16du wp14">
   <w:endnote w:type="separator" w:id="-1">
     <w:p>
       <w:pPr>
@@ -2878,7 +2985,7 @@
 </file>
 
 <file path=word/footnotes.xml><?xml version="1.0" encoding="utf-8"?>
-<w:footnotes xmlns:wpc="http://schemas.microsoft.com/office/word/2010/wordprocessingCanvas" xmlns:cx="http://schemas.microsoft.com/office/drawing/2014/chartex" xmlns:cx1="http://schemas.microsoft.com/office/drawing/2015/9/8/chartex" xmlns:cx2="http://schemas.microsoft.com/office/drawing/2015/10/21/chartex" xmlns:cx3="http://schemas.microsoft.com/office/drawing/2016/5/9/chartex" xmlns:cx4="http://schemas.microsoft.com/office/drawing/2016/5/10/chartex" xmlns:cx5="http://schemas.microsoft.com/office/drawing/2016/5/11/chartex" xmlns:cx6="http://schemas.microsoft.com/office/drawing/2016/5/12/chartex" xmlns:cx7="http://schemas.microsoft.com/office/drawing/2016/5/13/chartex" xmlns:cx8="http://schemas.microsoft.com/office/drawing/2016/5/14/chartex" xmlns:mc="http://schemas.openxmlformats.org/markup-compatibility/2006" xmlns:aink="http://schemas.microsoft.com/office/drawing/2016/ink" xmlns:am3d="http://schemas.microsoft.com/office/drawing/2017/model3d" xmlns:o="urn:schemas-microsoft-com:office:office" xmlns:oel="http://schemas.microsoft.com/office/2019/extlst" xmlns:r="http://schemas.openxmlformats.org/officeDocument/2006/relationships" xmlns:m="http://schemas.openxmlformats.org/officeDocument/2006/math" xmlns:v="urn:schemas-microsoft-com:vml" xmlns:wp14="http://schemas.microsoft.com/office/word/2010/wordprocessingDrawing" xmlns:wp="http://schemas.openxmlformats.org/drawingml/2006/wordprocessingDrawing" xmlns:w10="urn:schemas-microsoft-com:office:word" xmlns:w="http://schemas.openxmlformats.org/wordprocessingml/2006/main" xmlns:w14="http://schemas.microsoft.com/office/word/2010/wordml" xmlns:w15="http://schemas.microsoft.com/office/word/2012/wordml" xmlns:w16cex="http://schemas.microsoft.com/office/word/2018/wordml/cex" xmlns:w16cid="http://schemas.microsoft.com/office/word/2016/wordml/cid" xmlns:w16="http://schemas.microsoft.com/office/word/2018/wordml" xmlns:w16sdtdh="http://schemas.microsoft.com/office/word/2020/wordml/sdtdatahash" xmlns:w16se="http://schemas.microsoft.com/office/word/2015/wordml/symex" xmlns:wpg="http://schemas.microsoft.com/office/word/2010/wordprocessingGroup" xmlns:wpi="http://schemas.microsoft.com/office/word/2010/wordprocessingInk" xmlns:wne="http://schemas.microsoft.com/office/word/2006/wordml" xmlns:wps="http://schemas.microsoft.com/office/word/2010/wordprocessingShape" mc:Ignorable="w14 w15 w16se w16cid w16 w16cex w16sdtdh wp14">
+<w:footnotes xmlns:wpc="http://schemas.microsoft.com/office/word/2010/wordprocessingCanvas" xmlns:cx="http://schemas.microsoft.com/office/drawing/2014/chartex" xmlns:cx1="http://schemas.microsoft.com/office/drawing/2015/9/8/chartex" xmlns:cx2="http://schemas.microsoft.com/office/drawing/2015/10/21/chartex" xmlns:cx3="http://schemas.microsoft.com/office/drawing/2016/5/9/chartex" xmlns:cx4="http://schemas.microsoft.com/office/drawing/2016/5/10/chartex" xmlns:cx5="http://schemas.microsoft.com/office/drawing/2016/5/11/chartex" xmlns:cx6="http://schemas.microsoft.com/office/drawing/2016/5/12/chartex" xmlns:cx7="http://schemas.microsoft.com/office/drawing/2016/5/13/chartex" xmlns:cx8="http://schemas.microsoft.com/office/drawing/2016/5/14/chartex" xmlns:mc="http://schemas.openxmlformats.org/markup-compatibility/2006" xmlns:aink="http://schemas.microsoft.com/office/drawing/2016/ink" xmlns:am3d="http://schemas.microsoft.com/office/drawing/2017/model3d" xmlns:o="urn:schemas-microsoft-com:office:office" xmlns:oel="http://schemas.microsoft.com/office/2019/extlst" xmlns:r="http://schemas.openxmlformats.org/officeDocument/2006/relationships" xmlns:m="http://schemas.openxmlformats.org/officeDocument/2006/math" xmlns:v="urn:schemas-microsoft-com:vml" xmlns:wp14="http://schemas.microsoft.com/office/word/2010/wordprocessingDrawing" xmlns:wp="http://schemas.openxmlformats.org/drawingml/2006/wordprocessingDrawing" xmlns:w10="urn:schemas-microsoft-com:office:word" xmlns:w="http://schemas.openxmlformats.org/wordprocessingml/2006/main" xmlns:w14="http://schemas.microsoft.com/office/word/2010/wordml" xmlns:w15="http://schemas.microsoft.com/office/word/2012/wordml" xmlns:w16cex="http://schemas.microsoft.com/office/word/2018/wordml/cex" xmlns:w16cid="http://schemas.microsoft.com/office/word/2016/wordml/cid" xmlns:w16="http://schemas.microsoft.com/office/word/2018/wordml" xmlns:w16du="http://schemas.microsoft.com/office/word/2023/wordml/word16du" xmlns:w16sdtdh="http://schemas.microsoft.com/office/word/2020/wordml/sdtdatahash" xmlns:w16sdtfl="http://schemas.microsoft.com/office/word/2024/wordml/sdtformatlock" xmlns:w16se="http://schemas.microsoft.com/office/word/2015/wordml/symex" xmlns:wpg="http://schemas.microsoft.com/office/word/2010/wordprocessingGroup" xmlns:wpi="http://schemas.microsoft.com/office/word/2010/wordprocessingInk" xmlns:wne="http://schemas.microsoft.com/office/word/2006/wordml" xmlns:wps="http://schemas.microsoft.com/office/word/2010/wordprocessingShape" mc:Ignorable="w14 w15 w16se w16cid w16 w16cex w16sdtdh w16sdtfl w16du wp14">
   <w:footnote w:type="separator" w:id="-1">
     <w:p>
       <w:pPr>
@@ -2903,7 +3010,7 @@
 </file>
 
 <file path=word/numbering.xml><?xml version="1.0" encoding="utf-8"?>
-<w:numbering xmlns:wpc="http://schemas.microsoft.com/office/word/2010/wordprocessingCanvas" xmlns:cx="http://schemas.microsoft.com/office/drawing/2014/chartex" xmlns:cx1="http://schemas.microsoft.com/office/drawing/2015/9/8/chartex" xmlns:cx2="http://schemas.microsoft.com/office/drawing/2015/10/21/chartex" xmlns:cx3="http://schemas.microsoft.com/office/drawing/2016/5/9/chartex" xmlns:cx4="http://schemas.microsoft.com/office/drawing/2016/5/10/chartex" xmlns:cx5="http://schemas.microsoft.com/office/drawing/2016/5/11/chartex" xmlns:cx6="http://schemas.microsoft.com/office/drawing/2016/5/12/chartex" xmlns:cx7="http://schemas.microsoft.com/office/drawing/2016/5/13/chartex" xmlns:cx8="http://schemas.microsoft.com/office/drawing/2016/5/14/chartex" xmlns:mc="http://schemas.openxmlformats.org/markup-compatibility/2006" xmlns:aink="http://schemas.microsoft.com/office/drawing/2016/ink" xmlns:am3d="http://schemas.microsoft.com/office/drawing/2017/model3d" xmlns:o="urn:schemas-microsoft-com:office:office" xmlns:oel="http://schemas.microsoft.com/office/2019/extlst" xmlns:r="http://schemas.openxmlformats.org/officeDocument/2006/relationships" xmlns:m="http://schemas.openxmlformats.org/officeDocument/2006/math" xmlns:v="urn:schemas-microsoft-com:vml" xmlns:wp14="http://schemas.microsoft.com/office/word/2010/wordprocessingDrawing" xmlns:wp="http://schemas.openxmlformats.org/drawingml/2006/wordprocessingDrawing" xmlns:w10="urn:schemas-microsoft-com:office:word" xmlns:w="http://schemas.openxmlformats.org/wordprocessingml/2006/main" xmlns:w14="http://schemas.microsoft.com/office/word/2010/wordml" xmlns:w15="http://schemas.microsoft.com/office/word/2012/wordml" xmlns:w16cex="http://schemas.microsoft.com/office/word/2018/wordml/cex" xmlns:w16cid="http://schemas.microsoft.com/office/word/2016/wordml/cid" xmlns:w16="http://schemas.microsoft.com/office/word/2018/wordml" xmlns:w16sdtdh="http://schemas.microsoft.com/office/word/2020/wordml/sdtdatahash" xmlns:w16se="http://schemas.microsoft.com/office/word/2015/wordml/symex" xmlns:wpg="http://schemas.microsoft.com/office/word/2010/wordprocessingGroup" xmlns:wpi="http://schemas.microsoft.com/office/word/2010/wordprocessingInk" xmlns:wne="http://schemas.microsoft.com/office/word/2006/wordml" xmlns:wps="http://schemas.microsoft.com/office/word/2010/wordprocessingShape" mc:Ignorable="w14 w15 w16se w16cid w16 w16cex w16sdtdh wp14">
+<w:numbering xmlns:wpc="http://schemas.microsoft.com/office/word/2010/wordprocessingCanvas" xmlns:cx="http://schemas.microsoft.com/office/drawing/2014/chartex" xmlns:cx1="http://schemas.microsoft.com/office/drawing/2015/9/8/chartex" xmlns:cx2="http://schemas.microsoft.com/office/drawing/2015/10/21/chartex" xmlns:cx3="http://schemas.microsoft.com/office/drawing/2016/5/9/chartex" xmlns:cx4="http://schemas.microsoft.com/office/drawing/2016/5/10/chartex" xmlns:cx5="http://schemas.microsoft.com/office/drawing/2016/5/11/chartex" xmlns:cx6="http://schemas.microsoft.com/office/drawing/2016/5/12/chartex" xmlns:cx7="http://schemas.microsoft.com/office/drawing/2016/5/13/chartex" xmlns:cx8="http://schemas.microsoft.com/office/drawing/2016/5/14/chartex" xmlns:mc="http://schemas.openxmlformats.org/markup-compatibility/2006" xmlns:aink="http://schemas.microsoft.com/office/drawing/2016/ink" xmlns:am3d="http://schemas.microsoft.com/office/drawing/2017/model3d" xmlns:o="urn:schemas-microsoft-com:office:office" xmlns:oel="http://schemas.microsoft.com/office/2019/extlst" xmlns:r="http://schemas.openxmlformats.org/officeDocument/2006/relationships" xmlns:m="http://schemas.openxmlformats.org/officeDocument/2006/math" xmlns:v="urn:schemas-microsoft-com:vml" xmlns:wp14="http://schemas.microsoft.com/office/word/2010/wordprocessingDrawing" xmlns:wp="http://schemas.openxmlformats.org/drawingml/2006/wordprocessingDrawing" xmlns:w10="urn:schemas-microsoft-com:office:word" xmlns:w="http://schemas.openxmlformats.org/wordprocessingml/2006/main" xmlns:w14="http://schemas.microsoft.com/office/word/2010/wordml" xmlns:w15="http://schemas.microsoft.com/office/word/2012/wordml" xmlns:w16cex="http://schemas.microsoft.com/office/word/2018/wordml/cex" xmlns:w16cid="http://schemas.microsoft.com/office/word/2016/wordml/cid" xmlns:w16="http://schemas.microsoft.com/office/word/2018/wordml" xmlns:w16du="http://schemas.microsoft.com/office/word/2023/wordml/word16du" xmlns:w16sdtdh="http://schemas.microsoft.com/office/word/2020/wordml/sdtdatahash" xmlns:w16sdtfl="http://schemas.microsoft.com/office/word/2024/wordml/sdtformatlock" xmlns:w16se="http://schemas.microsoft.com/office/word/2015/wordml/symex" xmlns:wpg="http://schemas.microsoft.com/office/word/2010/wordprocessingGroup" xmlns:wpi="http://schemas.microsoft.com/office/word/2010/wordprocessingInk" xmlns:wne="http://schemas.microsoft.com/office/word/2006/wordml" xmlns:wps="http://schemas.microsoft.com/office/word/2010/wordprocessingShape" mc:Ignorable="w14 w15 w16se w16cid w16 w16cex w16sdtdh w16sdtfl w16du wp14">
   <w:abstractNum w:abstractNumId="0" w15:restartNumberingAfterBreak="0">
     <w:nsid w:val="00950F12"/>
     <w:multiLevelType w:val="hybridMultilevel"/>
@@ -3139,7 +3246,7 @@
 </file>
 
 <file path=word/styles.xml><?xml version="1.0" encoding="utf-8"?>
-<w:styles xmlns:mc="http://schemas.openxmlformats.org/markup-compatibility/2006" xmlns:r="http://schemas.openxmlformats.org/officeDocument/2006/relationships" xmlns:w="http://schemas.openxmlformats.org/wordprocessingml/2006/main" xmlns:w14="http://schemas.microsoft.com/office/word/2010/wordml" xmlns:w15="http://schemas.microsoft.com/office/word/2012/wordml" xmlns:w16cex="http://schemas.microsoft.com/office/word/2018/wordml/cex" xmlns:w16cid="http://schemas.microsoft.com/office/word/2016/wordml/cid" xmlns:w16="http://schemas.microsoft.com/office/word/2018/wordml" xmlns:w16sdtdh="http://schemas.microsoft.com/office/word/2020/wordml/sdtdatahash" xmlns:w16se="http://schemas.microsoft.com/office/word/2015/wordml/symex" mc:Ignorable="w14 w15 w16se w16cid w16 w16cex w16sdtdh">
+<w:styles xmlns:mc="http://schemas.openxmlformats.org/markup-compatibility/2006" xmlns:r="http://schemas.openxmlformats.org/officeDocument/2006/relationships" xmlns:w="http://schemas.openxmlformats.org/wordprocessingml/2006/main" xmlns:w14="http://schemas.microsoft.com/office/word/2010/wordml" xmlns:w15="http://schemas.microsoft.com/office/word/2012/wordml" xmlns:w16cex="http://schemas.microsoft.com/office/word/2018/wordml/cex" xmlns:w16cid="http://schemas.microsoft.com/office/word/2016/wordml/cid" xmlns:w16="http://schemas.microsoft.com/office/word/2018/wordml" xmlns:w16du="http://schemas.microsoft.com/office/word/2023/wordml/word16du" xmlns:w16sdtdh="http://schemas.microsoft.com/office/word/2020/wordml/sdtdatahash" xmlns:w16sdtfl="http://schemas.microsoft.com/office/word/2024/wordml/sdtformatlock" xmlns:w16se="http://schemas.microsoft.com/office/word/2015/wordml/symex" mc:Ignorable="w14 w15 w16se w16cid w16 w16cex w16sdtdh w16sdtfl w16du">
   <w:docDefaults>
     <w:rPrDefault>
       <w:rPr>

</xml_diff>